<commit_message>
finished project (93%, no java docs -7% :|. )
</commit_message>
<xml_diff>
--- a/MAS_koncowy/MAS_17_Mikusek_Katarzyna_s30338.docx
+++ b/MAS_koncowy/MAS_17_Mikusek_Katarzyna_s30338.docx
@@ -17,12 +17,21 @@
           <w:b/>
           <w:bCs/>
         </w:rPr>
-        <w:t>PreczBezrobocie</w:t>
+        <w:t>Preczbezrobocie</w:t>
       </w:r>
       <w:proofErr w:type="spellEnd"/>
     </w:p>
     <w:sdt>
       <w:sdtPr>
+        <w:rPr>
+          <w:rFonts w:asciiTheme="minorHAnsi" w:eastAsiaTheme="minorHAnsi" w:hAnsiTheme="minorHAnsi" w:cstheme="minorBidi"/>
+          <w:color w:val="auto"/>
+          <w:kern w:val="2"/>
+          <w:sz w:val="22"/>
+          <w:szCs w:val="22"/>
+          <w:lang w:eastAsia="en-US"/>
+          <w14:ligatures w14:val="standardContextual"/>
+        </w:rPr>
         <w:id w:val="-1230683263"/>
         <w:docPartObj>
           <w:docPartGallery w:val="Table of Contents"/>
@@ -31,15 +40,8 @@
       </w:sdtPr>
       <w:sdtEndPr>
         <w:rPr>
-          <w:rFonts w:asciiTheme="minorHAnsi" w:eastAsiaTheme="minorHAnsi" w:hAnsiTheme="minorHAnsi" w:cstheme="minorBidi"/>
-          <w:b/>
-          <w:bCs/>
-          <w:color w:val="auto"/>
-          <w:kern w:val="2"/>
-          <w:sz w:val="22"/>
-          <w:szCs w:val="22"/>
-          <w:lang w:eastAsia="en-US"/>
-          <w14:ligatures w14:val="standardContextual"/>
+          <w:b/>
+          <w:bCs/>
         </w:rPr>
       </w:sdtEndPr>
       <w:sdtContent>
@@ -543,7 +545,7 @@
                 <w:noProof/>
                 <w:webHidden/>
               </w:rPr>
-              <w:t>7</w:t>
+              <w:t>6</w:t>
             </w:r>
             <w:r>
               <w:rPr>
@@ -1242,7 +1244,13 @@
       </w:r>
       <w:proofErr w:type="spellEnd"/>
       <w:r>
-        <w:t>. Kandydaci ci muszą dostarczenia listu motywacyjnego (</w:t>
+        <w:t xml:space="preserve">. Kandydaci ci </w:t>
+      </w:r>
+      <w:r>
+        <w:t>są zobowiązani do</w:t>
+      </w:r>
+      <w:r>
+        <w:t xml:space="preserve"> dostarczenia listu motywacyjnego (</w:t>
       </w:r>
       <w:proofErr w:type="spellStart"/>
       <w:r>
@@ -1363,6 +1371,9 @@
       <w:r>
         <w:t>.</w:t>
       </w:r>
+      <w:r>
+        <w:t xml:space="preserve"> Pracownik ręcznie pobiera aplikacje kandydatów do wysłania.</w:t>
+      </w:r>
     </w:p>
     <w:p>
       <w:pPr>
@@ -1458,20 +1469,30 @@
       </w:pPr>
       <w:bookmarkStart w:id="1" w:name="_Toc231241197"/>
       <w:r>
-        <w:t>Diagram przypadków użycia</w:t>
-      </w:r>
-      <w:bookmarkEnd w:id="1"/>
-    </w:p>
-    <w:p>
-      <w:r>
         <w:rPr>
           <w:noProof/>
         </w:rPr>
         <w:drawing>
-          <wp:inline distT="0" distB="0" distL="0" distR="0" wp14:anchorId="7614E171" wp14:editId="28B47E42">
-            <wp:extent cx="5760720" cy="3540125"/>
-            <wp:effectExtent l="0" t="0" r="0" b="3175"/>
-            <wp:docPr id="1665576065" name="Obraz 1"/>
+          <wp:anchor distT="0" distB="0" distL="114300" distR="114300" simplePos="0" relativeHeight="251662336" behindDoc="1" locked="0" layoutInCell="1" allowOverlap="1" wp14:anchorId="3465AA70" wp14:editId="2010677A">
+            <wp:simplePos x="0" y="0"/>
+            <wp:positionH relativeFrom="margin">
+              <wp:align>center</wp:align>
+            </wp:positionH>
+            <wp:positionV relativeFrom="paragraph">
+              <wp:posOffset>391169</wp:posOffset>
+            </wp:positionV>
+            <wp:extent cx="6369596" cy="3910084"/>
+            <wp:effectExtent l="0" t="0" r="0" b="0"/>
+            <wp:wrapTight wrapText="bothSides">
+              <wp:wrapPolygon edited="0">
+                <wp:start x="0" y="0"/>
+                <wp:lineTo x="0" y="21470"/>
+                <wp:lineTo x="21514" y="21470"/>
+                <wp:lineTo x="21514" y="0"/>
+                <wp:lineTo x="0" y="0"/>
+              </wp:wrapPolygon>
+            </wp:wrapTight>
+            <wp:docPr id="1395031370" name="Grafika 1"/>
             <wp:cNvGraphicFramePr>
               <a:graphicFrameLocks xmlns:a="http://schemas.openxmlformats.org/drawingml/2006/main" noChangeAspect="1"/>
             </wp:cNvGraphicFramePr>
@@ -1479,14 +1500,14 @@
               <a:graphicData uri="http://schemas.openxmlformats.org/drawingml/2006/picture">
                 <pic:pic xmlns:pic="http://schemas.openxmlformats.org/drawingml/2006/picture">
                   <pic:nvPicPr>
-                    <pic:cNvPr id="1665576065" name="Obraz 1665576065"/>
+                    <pic:cNvPr id="1395031370" name="Grafika 1395031370"/>
                     <pic:cNvPicPr/>
                   </pic:nvPicPr>
                   <pic:blipFill>
-                    <a:blip r:embed="rId7" cstate="print">
+                    <a:blip r:embed="rId8">
                       <a:extLst>
-                        <a:ext uri="{28A0092B-C50C-407E-A947-70E740481C1C}">
-                          <a14:useLocalDpi xmlns:a14="http://schemas.microsoft.com/office/drawing/2010/main" val="0"/>
+                        <a:ext uri="{96DAC541-7B7A-43D3-8B79-37D633B846F1}">
+                          <asvg:svgBlip xmlns:asvg="http://schemas.microsoft.com/office/drawing/2016/SVG/main" r:embed="rId9"/>
                         </a:ext>
                       </a:extLst>
                     </a:blip>
@@ -1497,7 +1518,7 @@
                   <pic:spPr>
                     <a:xfrm>
                       <a:off x="0" y="0"/>
-                      <a:ext cx="5760720" cy="3540125"/>
+                      <a:ext cx="6369596" cy="3910084"/>
                     </a:xfrm>
                     <a:prstGeom prst="rect">
                       <a:avLst/>
@@ -1506,10 +1527,15 @@
                 </pic:pic>
               </a:graphicData>
             </a:graphic>
-          </wp:inline>
+          </wp:anchor>
         </w:drawing>
       </w:r>
-    </w:p>
+      <w:r>
+        <w:t>Diagram przypadków użycia</w:t>
+      </w:r>
+      <w:bookmarkEnd w:id="1"/>
+    </w:p>
+    <w:p/>
     <w:p>
       <w:pPr>
         <w:pStyle w:val="Nagwek2"/>
@@ -1605,16 +1631,7 @@
         </w:numPr>
       </w:pPr>
       <w:r>
-        <w:t xml:space="preserve">Usunięcie </w:t>
-      </w:r>
-      <w:r>
-        <w:t xml:space="preserve"> firmy z systemu</w:t>
-      </w:r>
-      <w:r>
-        <w:t xml:space="preserve"> powinno powodować automatyczne usunięcie wszystkich powiązanych </w:t>
-      </w:r>
-      <w:r>
-        <w:t>ofert pracy</w:t>
+        <w:t>Interfejs powinien być prosty i intuicyjny, tak aby pracownik firmy mógł obsługiwać system</w:t>
       </w:r>
       <w:r>
         <w:t>.</w:t>
@@ -1629,10 +1646,7 @@
         </w:numPr>
       </w:pPr>
       <w:r>
-        <w:t>Interfejs powinien być prosty i intuicyjny, tak aby pracownik firmy mógł obsługiwać system</w:t>
-      </w:r>
-      <w:r>
-        <w:t>.</w:t>
+        <w:t>System powinien umożliwiać łatwe wyszukiwanie ofert pracy, kandydatów oraz firm znajdujących się w bazie danych.</w:t>
       </w:r>
     </w:p>
     <w:p>
@@ -1644,7 +1658,13 @@
         </w:numPr>
       </w:pPr>
       <w:r>
-        <w:t>System powinien umożliwiać łatwe wyszukiwanie ofert pracy, kandydatów oraz firm znajdujących się w bazie danych.</w:t>
+        <w:t xml:space="preserve">System powinien być odporny na wprowadzanie niepoprawnych </w:t>
+      </w:r>
+      <w:r>
+        <w:t>danych</w:t>
+      </w:r>
+      <w:r>
+        <w:t>, np. pustych pól wymaganych lub nieprawidłowych dat.</w:t>
       </w:r>
     </w:p>
     <w:p>
@@ -1656,13 +1676,10 @@
         </w:numPr>
       </w:pPr>
       <w:r>
-        <w:t xml:space="preserve">System powinien być odporny na wprowadzanie niepoprawnych </w:t>
-      </w:r>
-      <w:r>
-        <w:t>danych</w:t>
-      </w:r>
-      <w:r>
-        <w:t>, np. pustych pól wymaganych lub nieprawidłowych dat.</w:t>
+        <w:t>System powinien zapewniać możliwość</w:t>
+      </w:r>
+      <w:r>
+        <w:t xml:space="preserve"> przechowywania historii adresów firm.</w:t>
       </w:r>
     </w:p>
     <w:p>
@@ -1674,10 +1691,7 @@
         </w:numPr>
       </w:pPr>
       <w:r>
-        <w:t>System powinien zapewniać możliwość</w:t>
-      </w:r>
-      <w:r>
-        <w:t xml:space="preserve"> przechowywania historii adresów firm.</w:t>
+        <w:t>Aplikacja powinna być zbudowana w sposób umożliwiający dalszą rozbudowę systemu o nowe funkcjonalności.</w:t>
       </w:r>
     </w:p>
     <w:p>
@@ -1689,7 +1703,8 @@
         </w:numPr>
       </w:pPr>
       <w:r>
-        <w:t>Aplikacja powinna być zbudowana w sposób umożliwiający dalszą rozbudowę systemu o nowe funkcjonalności.</w:t>
+        <w:lastRenderedPageBreak/>
+        <w:t>Dane powinny być dostępne wyłącznie z poziomu komputera firmowego posiadającego aplikację.</w:t>
       </w:r>
     </w:p>
     <w:p>
@@ -1701,19 +1716,6 @@
         </w:numPr>
       </w:pPr>
       <w:r>
-        <w:lastRenderedPageBreak/>
-        <w:t>Dane powinny być dostępne wyłącznie z poziomu komputera firmowego posiadającego aplikację.</w:t>
-      </w:r>
-    </w:p>
-    <w:p>
-      <w:pPr>
-        <w:pStyle w:val="Akapitzlist"/>
-        <w:numPr>
-          <w:ilvl w:val="0"/>
-          <w:numId w:val="5"/>
-        </w:numPr>
-      </w:pPr>
-      <w:r>
         <w:t>System powinien obsługiwać automatyczne zmiany statusów ofert pracy bez konieczności ingerencji użytkownika.</w:t>
       </w:r>
     </w:p>
@@ -1727,26 +1729,26 @@
           <w:noProof/>
         </w:rPr>
         <w:drawing>
-          <wp:anchor distT="0" distB="0" distL="114300" distR="114300" simplePos="0" relativeHeight="251658240" behindDoc="1" locked="0" layoutInCell="1" allowOverlap="1" wp14:anchorId="26CE127D" wp14:editId="1F0BF4A1">
+          <wp:anchor distT="0" distB="0" distL="114300" distR="114300" simplePos="0" relativeHeight="251661312" behindDoc="1" locked="0" layoutInCell="1" allowOverlap="1" wp14:anchorId="6AC3443D" wp14:editId="5C9F43F0">
             <wp:simplePos x="0" y="0"/>
             <wp:positionH relativeFrom="margin">
               <wp:align>center</wp:align>
             </wp:positionH>
             <wp:positionV relativeFrom="paragraph">
-              <wp:posOffset>254985</wp:posOffset>
+              <wp:posOffset>310515</wp:posOffset>
             </wp:positionV>
-            <wp:extent cx="7391400" cy="6099810"/>
+            <wp:extent cx="7244715" cy="5962650"/>
             <wp:effectExtent l="0" t="0" r="0" b="0"/>
             <wp:wrapTight wrapText="bothSides">
               <wp:wrapPolygon edited="0">
                 <wp:start x="0" y="0"/>
-                <wp:lineTo x="0" y="21519"/>
-                <wp:lineTo x="21544" y="21519"/>
-                <wp:lineTo x="21544" y="0"/>
+                <wp:lineTo x="0" y="21531"/>
+                <wp:lineTo x="21526" y="21531"/>
+                <wp:lineTo x="21526" y="0"/>
                 <wp:lineTo x="0" y="0"/>
               </wp:wrapPolygon>
             </wp:wrapTight>
-            <wp:docPr id="102420038" name="Obraz 2"/>
+            <wp:docPr id="1243791058" name="Grafika 1"/>
             <wp:cNvGraphicFramePr>
               <a:graphicFrameLocks xmlns:a="http://schemas.openxmlformats.org/drawingml/2006/main" noChangeAspect="1"/>
             </wp:cNvGraphicFramePr>
@@ -1754,14 +1756,14 @@
               <a:graphicData uri="http://schemas.openxmlformats.org/drawingml/2006/picture">
                 <pic:pic xmlns:pic="http://schemas.openxmlformats.org/drawingml/2006/picture">
                   <pic:nvPicPr>
-                    <pic:cNvPr id="102420038" name="Obraz 102420038"/>
+                    <pic:cNvPr id="1243791058" name="Grafika 1243791058"/>
                     <pic:cNvPicPr/>
                   </pic:nvPicPr>
                   <pic:blipFill>
-                    <a:blip r:embed="rId8" cstate="print">
+                    <a:blip r:embed="rId10">
                       <a:extLst>
-                        <a:ext uri="{28A0092B-C50C-407E-A947-70E740481C1C}">
-                          <a14:useLocalDpi xmlns:a14="http://schemas.microsoft.com/office/drawing/2010/main" val="0"/>
+                        <a:ext uri="{96DAC541-7B7A-43D3-8B79-37D633B846F1}">
+                          <asvg:svgBlip xmlns:asvg="http://schemas.microsoft.com/office/drawing/2016/SVG/main" r:embed="rId11"/>
                         </a:ext>
                       </a:extLst>
                     </a:blip>
@@ -1772,7 +1774,7 @@
                   <pic:spPr>
                     <a:xfrm>
                       <a:off x="0" y="0"/>
-                      <a:ext cx="7391400" cy="6099810"/>
+                      <a:ext cx="7244715" cy="5962650"/>
                     </a:xfrm>
                     <a:prstGeom prst="rect">
                       <a:avLst/>
@@ -1793,20 +1795,8 @@
       <w:r>
         <w:t>Diagramy klas, analityczny i projektowy</w:t>
       </w:r>
+      <w:bookmarkStart w:id="4" w:name="_Toc231241200"/>
       <w:bookmarkEnd w:id="3"/>
-    </w:p>
-    <w:p/>
-    <w:p/>
-    <w:p>
-      <w:pPr>
-        <w:rPr>
-          <w:rFonts w:asciiTheme="majorHAnsi" w:eastAsiaTheme="majorEastAsia" w:hAnsiTheme="majorHAnsi" w:cstheme="majorBidi"/>
-          <w:color w:val="2F5496" w:themeColor="accent1" w:themeShade="BF"/>
-          <w:sz w:val="32"/>
-          <w:szCs w:val="32"/>
-        </w:rPr>
-      </w:pPr>
-      <w:bookmarkStart w:id="4" w:name="_Toc231241200"/>
       <w:r>
         <w:br w:type="page"/>
       </w:r>
@@ -2173,6 +2163,11 @@
       </w:r>
     </w:p>
     <w:p>
+      <w:r>
+        <w:br w:type="page"/>
+      </w:r>
+    </w:p>
+    <w:p>
       <w:pPr>
         <w:spacing w:after="0"/>
         <w:rPr>
@@ -2185,18 +2180,26 @@
         </w:rPr>
         <w:lastRenderedPageBreak/>
         <w:drawing>
-          <wp:anchor distT="0" distB="0" distL="114300" distR="114300" simplePos="0" relativeHeight="251659264" behindDoc="0" locked="0" layoutInCell="1" allowOverlap="1" wp14:anchorId="454A19E4" wp14:editId="248C4A41">
+          <wp:anchor distT="0" distB="0" distL="114300" distR="114300" simplePos="0" relativeHeight="251663360" behindDoc="1" locked="0" layoutInCell="1" allowOverlap="1" wp14:anchorId="33D9B248" wp14:editId="735BDF24">
             <wp:simplePos x="0" y="0"/>
             <wp:positionH relativeFrom="margin">
-              <wp:align>center</wp:align>
+              <wp:posOffset>-763601</wp:posOffset>
             </wp:positionH>
             <wp:positionV relativeFrom="paragraph">
-              <wp:posOffset>548640</wp:posOffset>
+              <wp:posOffset>498475</wp:posOffset>
             </wp:positionV>
-            <wp:extent cx="7411085" cy="3371215"/>
-            <wp:effectExtent l="0" t="0" r="0" b="635"/>
-            <wp:wrapSquare wrapText="bothSides"/>
-            <wp:docPr id="2098128422" name="Obraz 3"/>
+            <wp:extent cx="7257415" cy="3295650"/>
+            <wp:effectExtent l="0" t="0" r="635" b="0"/>
+            <wp:wrapTight wrapText="bothSides">
+              <wp:wrapPolygon edited="0">
+                <wp:start x="0" y="0"/>
+                <wp:lineTo x="0" y="21475"/>
+                <wp:lineTo x="21545" y="21475"/>
+                <wp:lineTo x="21545" y="0"/>
+                <wp:lineTo x="0" y="0"/>
+              </wp:wrapPolygon>
+            </wp:wrapTight>
+            <wp:docPr id="441649568" name="Grafika 2"/>
             <wp:cNvGraphicFramePr>
               <a:graphicFrameLocks xmlns:a="http://schemas.openxmlformats.org/drawingml/2006/main" noChangeAspect="1"/>
             </wp:cNvGraphicFramePr>
@@ -2204,14 +2207,14 @@
               <a:graphicData uri="http://schemas.openxmlformats.org/drawingml/2006/picture">
                 <pic:pic xmlns:pic="http://schemas.openxmlformats.org/drawingml/2006/picture">
                   <pic:nvPicPr>
-                    <pic:cNvPr id="2098128422" name="Obraz 2098128422"/>
+                    <pic:cNvPr id="441649568" name="Grafika 441649568"/>
                     <pic:cNvPicPr/>
                   </pic:nvPicPr>
                   <pic:blipFill>
-                    <a:blip r:embed="rId9" cstate="print">
+                    <a:blip r:embed="rId12">
                       <a:extLst>
-                        <a:ext uri="{28A0092B-C50C-407E-A947-70E740481C1C}">
-                          <a14:useLocalDpi xmlns:a14="http://schemas.microsoft.com/office/drawing/2010/main" val="0"/>
+                        <a:ext uri="{96DAC541-7B7A-43D3-8B79-37D633B846F1}">
+                          <asvg:svgBlip xmlns:asvg="http://schemas.microsoft.com/office/drawing/2016/SVG/main" r:embed="rId13"/>
                         </a:ext>
                       </a:extLst>
                     </a:blip>
@@ -2222,7 +2225,7 @@
                   <pic:spPr>
                     <a:xfrm>
                       <a:off x="0" y="0"/>
-                      <a:ext cx="7411085" cy="3371215"/>
+                      <a:ext cx="7257415" cy="3295650"/>
                     </a:xfrm>
                     <a:prstGeom prst="rect">
                       <a:avLst/>
@@ -2265,26 +2268,26 @@
           <w:noProof/>
         </w:rPr>
         <w:drawing>
-          <wp:anchor distT="0" distB="0" distL="114300" distR="114300" simplePos="0" relativeHeight="251660288" behindDoc="1" locked="0" layoutInCell="1" allowOverlap="1" wp14:anchorId="30D67221" wp14:editId="532F9A7E">
+          <wp:anchor distT="0" distB="0" distL="114300" distR="114300" simplePos="0" relativeHeight="251666432" behindDoc="1" locked="0" layoutInCell="1" allowOverlap="1" wp14:anchorId="3EDE77E1" wp14:editId="27F9A3FA">
             <wp:simplePos x="0" y="0"/>
             <wp:positionH relativeFrom="margin">
               <wp:align>center</wp:align>
             </wp:positionH>
             <wp:positionV relativeFrom="paragraph">
-              <wp:posOffset>450961</wp:posOffset>
+              <wp:posOffset>400685</wp:posOffset>
             </wp:positionV>
-            <wp:extent cx="6870700" cy="2838450"/>
-            <wp:effectExtent l="0" t="0" r="6350" b="0"/>
+            <wp:extent cx="7049135" cy="2837180"/>
+            <wp:effectExtent l="0" t="0" r="0" b="1270"/>
             <wp:wrapTight wrapText="bothSides">
               <wp:wrapPolygon edited="0">
                 <wp:start x="0" y="0"/>
-                <wp:lineTo x="0" y="21455"/>
-                <wp:lineTo x="21560" y="21455"/>
-                <wp:lineTo x="21560" y="0"/>
+                <wp:lineTo x="0" y="21465"/>
+                <wp:lineTo x="21540" y="21465"/>
+                <wp:lineTo x="21540" y="0"/>
                 <wp:lineTo x="0" y="0"/>
               </wp:wrapPolygon>
             </wp:wrapTight>
-            <wp:docPr id="748990574" name="Obraz 4"/>
+            <wp:docPr id="459367103" name="Grafika 3"/>
             <wp:cNvGraphicFramePr>
               <a:graphicFrameLocks xmlns:a="http://schemas.openxmlformats.org/drawingml/2006/main" noChangeAspect="1"/>
             </wp:cNvGraphicFramePr>
@@ -2292,18 +2295,18 @@
               <a:graphicData uri="http://schemas.openxmlformats.org/drawingml/2006/picture">
                 <pic:pic xmlns:pic="http://schemas.openxmlformats.org/drawingml/2006/picture">
                   <pic:nvPicPr>
-                    <pic:cNvPr id="748990574" name="Obraz 748990574"/>
+                    <pic:cNvPr id="459367103" name="Grafika 459367103"/>
                     <pic:cNvPicPr/>
                   </pic:nvPicPr>
                   <pic:blipFill rotWithShape="1">
-                    <a:blip r:embed="rId10" cstate="print">
+                    <a:blip r:embed="rId14">
                       <a:extLst>
-                        <a:ext uri="{28A0092B-C50C-407E-A947-70E740481C1C}">
-                          <a14:useLocalDpi xmlns:a14="http://schemas.microsoft.com/office/drawing/2010/main" val="0"/>
+                        <a:ext uri="{96DAC541-7B7A-43D3-8B79-37D633B846F1}">
+                          <asvg:svgBlip xmlns:asvg="http://schemas.microsoft.com/office/drawing/2016/SVG/main" r:embed="rId15"/>
                         </a:ext>
                       </a:extLst>
                     </a:blip>
-                    <a:srcRect l="1104"/>
+                    <a:srcRect l="627"/>
                     <a:stretch>
                       <a:fillRect/>
                     </a:stretch>
@@ -2311,7 +2314,7 @@
                   <pic:spPr bwMode="auto">
                     <a:xfrm>
                       <a:off x="0" y="0"/>
-                      <a:ext cx="6870700" cy="2838450"/>
+                      <a:ext cx="7049135" cy="2837180"/>
                     </a:xfrm>
                     <a:prstGeom prst="rect">
                       <a:avLst/>
@@ -2357,22 +2360,60 @@
         <w:pStyle w:val="Nagwek2"/>
       </w:pPr>
       <w:bookmarkStart w:id="6" w:name="_Toc231241202"/>
-      <w:r>
+    </w:p>
+    <w:p>
+      <w:pPr>
+        <w:pStyle w:val="Nagwek2"/>
+      </w:pPr>
+    </w:p>
+    <w:p>
+      <w:pPr>
+        <w:pStyle w:val="Nagwek2"/>
+      </w:pPr>
+    </w:p>
+    <w:bookmarkEnd w:id="6"/>
+    <w:p>
+      <w:pPr>
+        <w:pStyle w:val="Nagwek2"/>
+        <w:sectPr>
+          <w:headerReference w:type="default" r:id="rId16"/>
+          <w:pgSz w:w="11906" w:h="16838"/>
+          <w:pgMar w:top="1417" w:right="1417" w:bottom="1417" w:left="1417" w:header="708" w:footer="708" w:gutter="0"/>
+          <w:cols w:space="708"/>
+          <w:docGrid w:linePitch="360"/>
+        </w:sectPr>
+      </w:pPr>
+    </w:p>
+    <w:p>
+      <w:pPr>
+        <w:pStyle w:val="Nagwek2"/>
+      </w:pPr>
+      <w:r>
+        <w:rPr>
+          <w:noProof/>
+        </w:rPr>
         <w:lastRenderedPageBreak/>
-        <w:t>Propozycje GUI</w:t>
-      </w:r>
-      <w:bookmarkEnd w:id="6"/>
-    </w:p>
-    <w:p>
-      <w:r>
-        <w:rPr>
-          <w:noProof/>
-        </w:rPr>
         <w:drawing>
-          <wp:inline distT="0" distB="0" distL="0" distR="0" wp14:anchorId="093D071D" wp14:editId="5F1F3F58">
-            <wp:extent cx="8458934" cy="4758151"/>
-            <wp:effectExtent l="2540" t="0" r="1905" b="1905"/>
-            <wp:docPr id="1306443362" name="Obraz 3"/>
+          <wp:anchor distT="0" distB="0" distL="114300" distR="114300" simplePos="0" relativeHeight="251667456" behindDoc="1" locked="0" layoutInCell="1" allowOverlap="1" wp14:anchorId="63A32295" wp14:editId="26C9E5E3">
+            <wp:simplePos x="0" y="0"/>
+            <wp:positionH relativeFrom="margin">
+              <wp:align>center</wp:align>
+            </wp:positionH>
+            <wp:positionV relativeFrom="paragraph">
+              <wp:posOffset>369570</wp:posOffset>
+            </wp:positionV>
+            <wp:extent cx="9980930" cy="4762500"/>
+            <wp:effectExtent l="0" t="0" r="1270" b="0"/>
+            <wp:wrapTight wrapText="bothSides">
+              <wp:wrapPolygon edited="0">
+                <wp:start x="0" y="0"/>
+                <wp:lineTo x="0" y="21514"/>
+                <wp:lineTo x="21562" y="21514"/>
+                <wp:lineTo x="21562" y="0"/>
+                <wp:lineTo x="0" y="0"/>
+              </wp:wrapPolygon>
+            </wp:wrapTight>
+            <wp:docPr id="1698328109" name="Obraz 4"/>
             <wp:cNvGraphicFramePr>
               <a:graphicFrameLocks xmlns:a="http://schemas.openxmlformats.org/drawingml/2006/main" noChangeAspect="1"/>
             </wp:cNvGraphicFramePr>
@@ -2380,45 +2421,76 @@
               <a:graphicData uri="http://schemas.openxmlformats.org/drawingml/2006/picture">
                 <pic:pic xmlns:pic="http://schemas.openxmlformats.org/drawingml/2006/picture">
                   <pic:nvPicPr>
-                    <pic:cNvPr id="1306443362" name="Obraz 1306443362"/>
+                    <pic:cNvPr id="1698328109" name="Obraz 1698328109"/>
                     <pic:cNvPicPr/>
                   </pic:nvPicPr>
-                  <pic:blipFill>
-                    <a:blip r:embed="rId11">
+                  <pic:blipFill rotWithShape="1">
+                    <a:blip r:embed="rId17">
                       <a:extLst>
                         <a:ext uri="{28A0092B-C50C-407E-A947-70E740481C1C}">
                           <a14:useLocalDpi xmlns:a14="http://schemas.microsoft.com/office/drawing/2010/main" val="0"/>
                         </a:ext>
                       </a:extLst>
                     </a:blip>
+                    <a:srcRect l="2570" t="9904" r="2086" b="9218"/>
                     <a:stretch>
                       <a:fillRect/>
                     </a:stretch>
                   </pic:blipFill>
-                  <pic:spPr>
-                    <a:xfrm rot="16200000">
+                  <pic:spPr bwMode="auto">
+                    <a:xfrm>
                       <a:off x="0" y="0"/>
-                      <a:ext cx="8483441" cy="4771936"/>
+                      <a:ext cx="9980930" cy="4762500"/>
                     </a:xfrm>
                     <a:prstGeom prst="rect">
                       <a:avLst/>
                     </a:prstGeom>
+                    <a:ln>
+                      <a:noFill/>
+                    </a:ln>
+                    <a:extLst>
+                      <a:ext uri="{53640926-AAD7-44D8-BBD7-CCE9431645EC}">
+                        <a14:shadowObscured xmlns:a14="http://schemas.microsoft.com/office/drawing/2010/main"/>
+                      </a:ext>
+                    </a:extLst>
                   </pic:spPr>
                 </pic:pic>
               </a:graphicData>
             </a:graphic>
-          </wp:inline>
+            <wp14:sizeRelH relativeFrom="margin">
+              <wp14:pctWidth>0</wp14:pctWidth>
+            </wp14:sizeRelH>
+            <wp14:sizeRelV relativeFrom="margin">
+              <wp14:pctHeight>0</wp14:pctHeight>
+            </wp14:sizeRelV>
+          </wp:anchor>
         </w:drawing>
       </w:r>
+      <w:r>
+        <w:t>Propozycja GUI</w:t>
+      </w:r>
+      <w:bookmarkStart w:id="7" w:name="_Toc231241203"/>
+    </w:p>
+    <w:p>
+      <w:pPr>
+        <w:sectPr>
+          <w:pgSz w:w="16838" w:h="11906" w:orient="landscape"/>
+          <w:pgMar w:top="1418" w:right="1418" w:bottom="1418" w:left="1418" w:header="709" w:footer="709" w:gutter="0"/>
+          <w:cols w:space="708"/>
+          <w:docGrid w:linePitch="360"/>
+        </w:sectPr>
+      </w:pPr>
     </w:p>
     <w:p>
       <w:pPr>
         <w:pStyle w:val="Nagwek2"/>
       </w:pPr>
-      <w:bookmarkStart w:id="7" w:name="_Toc231241203"/>
       <w:r>
         <w:lastRenderedPageBreak/>
-        <w:t>Omówienie decyzji projektowych i skutków analizy dynamicznej.</w:t>
+        <w:t>O</w:t>
+      </w:r>
+      <w:r>
+        <w:t>mówienie decyzji projektowych i skutków analizy dynamicznej.</w:t>
       </w:r>
       <w:bookmarkEnd w:id="7"/>
     </w:p>
@@ -3867,7 +3939,7 @@
         <w:spacing w:after="0"/>
       </w:pPr>
       <w:r>
-        <w:t>Oferta pracy nie może istnieć bez firmy, usunięcie firmy powinno spowodować usunięcie wszystkich jej ofert, a to gwarantuje kompozycja.</w:t>
+        <w:t>Oferta pracy nie może istnieć bez firmy, a to gwarantuje kompozycja.</w:t>
       </w:r>
     </w:p>
     <w:p>
@@ -3940,17 +4012,43 @@
       <w:r>
         <w:t xml:space="preserve">. Jest on potrzebny, ponieważ tylko specyficzny (format </w:t>
       </w:r>
-      <w:proofErr w:type="spellStart"/>
-      <w:r>
-        <w:rPr>
-          <w:b/>
-          <w:bCs/>
-        </w:rPr>
-        <w:t>Nazwisko_Imie_numer</w:t>
-      </w:r>
-      <w:proofErr w:type="spellEnd"/>
-      <w:r>
-        <w:t xml:space="preserve">) indeks jednoznacznie </w:t>
+      <w:r>
+        <w:rPr>
+          <w:b/>
+          <w:bCs/>
+        </w:rPr>
+        <w:t>Nazwisko_</w:t>
+      </w:r>
+      <w:r>
+        <w:rPr>
+          <w:b/>
+          <w:bCs/>
+        </w:rPr>
+        <w:t xml:space="preserve"> </w:t>
+      </w:r>
+      <w:r>
+        <w:rPr>
+          <w:b/>
+          <w:bCs/>
+        </w:rPr>
+        <w:t>numer</w:t>
+      </w:r>
+      <w:r>
+        <w:t>)</w:t>
+      </w:r>
+      <w:r>
+        <w:t xml:space="preserve">, gdzie numer to </w:t>
+      </w:r>
+      <w:proofErr w:type="spellStart"/>
+      <w:r>
+        <w:t>timestamp</w:t>
+      </w:r>
+      <w:proofErr w:type="spellEnd"/>
+      <w:r>
+        <w:t xml:space="preserve"> złożenia aplikacji. I</w:t>
+      </w:r>
+      <w:r>
+        <w:t xml:space="preserve">ndeks jednoznacznie </w:t>
       </w:r>
       <w:proofErr w:type="spellStart"/>
       <w:r>
@@ -4152,9 +4250,8 @@
       </w:r>
     </w:p>
     <w:sectPr>
-      <w:headerReference w:type="default" r:id="rId12"/>
       <w:pgSz w:w="11906" w:h="16838"/>
-      <w:pgMar w:top="1417" w:right="1417" w:bottom="1417" w:left="1417" w:header="708" w:footer="708" w:gutter="0"/>
+      <w:pgMar w:top="1418" w:right="1418" w:bottom="1418" w:left="1418" w:header="709" w:footer="709" w:gutter="0"/>
       <w:cols w:space="708"/>
       <w:docGrid w:linePitch="360"/>
     </w:sectPr>
@@ -6100,6 +6197,7 @@
   <w:style w:type="character" w:default="1" w:styleId="Domylnaczcionkaakapitu">
     <w:name w:val="Default Paragraph Font"/>
     <w:uiPriority w:val="1"/>
+    <w:semiHidden/>
     <w:unhideWhenUsed/>
   </w:style>
   <w:style w:type="table" w:default="1" w:styleId="Standardowy">
@@ -6857,4 +6955,16 @@
     </a:ext>
   </a:extLst>
 </a:theme>
+</file>
+
+<file path=customXml/item1.xml><?xml version="1.0" encoding="utf-8"?>
+<b:Sources xmlns:b="http://schemas.openxmlformats.org/officeDocument/2006/bibliography" xmlns="http://schemas.openxmlformats.org/officeDocument/2006/bibliography" SelectedStyle="\APASixthEditionOfficeOnline.xsl" StyleName="APA" Version="6"/>
+</file>
+
+<file path=customXml/itemProps1.xml><?xml version="1.0" encoding="utf-8"?>
+<ds:datastoreItem xmlns:ds="http://schemas.openxmlformats.org/officeDocument/2006/customXml" ds:itemID="{23BBE64B-A763-4AA3-B689-C6002C413707}">
+  <ds:schemaRefs>
+    <ds:schemaRef ds:uri="http://schemas.openxmlformats.org/officeDocument/2006/bibliography"/>
+  </ds:schemaRefs>
+</ds:datastoreItem>
 </file>
</xml_diff>